<commit_message>
Remove a faixa de aviso do painel restrito, a pedido
O recorte continua igual: o Painel de Ativos, os saldos, os extratos e os movimentos
seguem mostrando só os lançamentos da pessoa. O que sai é só o anúncio disso na tela.

Retirada COMPLETA — elemento, função e estilo. Meio removida, sobraria um
`getElementById` procurando o que ninguém desenha mais, e uma regra de CSS órfã para o
próximo leitor procurar. Os dois testes que cobriam o texto da faixa viraram testes da
retirada, e as duas sabotagens correspondentes também.

Fica registrado no CLAUDE.md que a decisão foi de quem usa, para a faixa não voltar por
engano num próximo trabalho — e junto a consequência conhecida: quem tem o painel
restrito e ainda não lançou nada vê zeros e uma tabela vazia, sem nada na tela dizendo
por quê. O manual passa a avisar quem administra para combinar isso com a pessoa.

teste_api.js 474 · teste_tela.js 564 · teste_permissoes.js 80.

Co-Authored-By: Claude Opus 5 <noreply@anthropic.com>
</commit_message>
<xml_diff>
--- a/manual.docx
+++ b/manual.docx
@@ -7761,7 +7761,7 @@
           <w:b w:val="0"/>
           <w:i w:val="0"/>
         </w:rPr>
-        <w:t xml:space="preserve">Quem está nesse modo vê uma </w:t>
+        <w:t xml:space="preserve">A tela de quem está restrito </w:t>
       </w:r>
       <w:r>
         <w:rPr>
@@ -7769,15 +7769,15 @@
           <w:b/>
           <w:i w:val="0"/>
         </w:rPr>
-        <w:t>faixa âmbar no alto</w:t>
-      </w:r>
-      <w:r>
-        <w:rPr>
-          <w:rFonts w:ascii="Segoe UI" w:hAnsi="Segoe UI"/>
-          <w:b w:val="0"/>
-          <w:i w:val="0"/>
-        </w:rPr>
-        <w:t xml:space="preserve"> dizendo que o painel está recortado. Sem ela, os números seriam lidos como os da operação e pareceria que o galpão parou.</w:t>
+        <w:t>não avisa</w:t>
+      </w:r>
+      <w:r>
+        <w:rPr>
+          <w:rFonts w:ascii="Segoe UI" w:hAnsi="Segoe UI"/>
+          <w:b w:val="0"/>
+          <w:i w:val="0"/>
+        </w:rPr>
+        <w:t xml:space="preserve"> que está: ela mostra os números dela e pronto. Quem ainda não lançou nada vê zeros. Vale combinar com a pessoa, para ela não achar que o painel quebrou.</w:t>
       </w:r>
     </w:p>
     <w:p>
@@ -11137,7 +11137,7 @@
           <w:rFonts w:ascii="Consolas" w:hAnsi="Consolas"/>
           <w:sz w:val="20"/>
         </w:rPr>
-        <w:t>node teste/teste_api.js → 472 verificações das regrasnode teste/teste_tela.js → 565 verificações das telasnode teste/teste_permissoes.js → 80 verificações das permissões</w:t>
+        <w:t>node teste/teste_api.js → 472 verificações das regrasnode teste/teste_tela.js → 564 verificações das telasnode teste/teste_permissoes.js → 80 verificações das permissões</w:t>
       </w:r>
     </w:p>
     <w:p>

</xml_diff>